<commit_message>
7fcec1ea1be32515c28ae78f9b4f95d27589c440 deploy: siteground artifact
</commit_message>
<xml_diff>
--- a/hub/manuals/calendar-advanced.docx
+++ b/hub/manuals/calendar-advanced.docx
@@ -1264,7 +1264,17 @@
         <w:t xml:space="preserve">CITENG</w:t>
       </w:r>
       <w:r>
-        <w:t xml:space="preserve">. Choose </w:t>
+        <w:t xml:space="preserve">. To see them, choose a ministry in </w:t>
+      </w:r>
+      <w:r>
+        <w:rPr>
+          <w:b/>
+          <w:bCs/>
+        </w:rPr>
+        <w:t xml:space="preserve">Lead Ministry</w:t>
+      </w:r>
+      <w:r>
+        <w:t xml:space="preserve">: in a ministry, choose your own (this also lists activities shared with it); in an HQ organization, choose </w:t>
       </w:r>
       <w:r>
         <w:rPr>
@@ -1274,17 +1284,25 @@
         <w:t xml:space="preserve">CITENG</w:t>
       </w:r>
       <w:r>
-        <w:t xml:space="preserve"> in </w:t>
-      </w:r>
-      <w:r>
-        <w:rPr>
-          <w:b/>
-          <w:bCs/>
-        </w:rPr>
-        <w:t xml:space="preserve">Lead Ministry</w:t>
-      </w:r>
-      <w:r>
-        <w:t xml:space="preserve"> to see them.</w:t>
+        <w:t xml:space="preserve">.</w:t>
+      </w:r>
+    </w:p>
+    <w:p>
+      <w:pPr>
+        <w:spacing w:after="120"/>
+      </w:pPr>
+      <w:r>
+        <w:t xml:space="preserve">Both kinds always show under </w:t>
+      </w:r>
+      <w:r>
+        <w:rPr>
+          <w:b/>
+          <w:bCs/>
+        </w:rPr>
+        <w:t xml:space="preserve">My Watchlist Only</w:t>
+      </w:r>
+      <w:r>
+        <w:t xml:space="preserve">.</w:t>
       </w:r>
     </w:p>
     <w:p>

</xml_diff>

<commit_message>
b615006eff9ed1422446e8d19e6e826df1aca815 deploy: siteground artifact
</commit_message>
<xml_diff>
--- a/hub/manuals/calendar-advanced.docx
+++ b/hub/manuals/calendar-advanced.docx
@@ -2644,6 +2644,22 @@
       </w:r>
       <w:r>
         <w:t xml:space="preserve"> and other administrator tasks, see the Calendar administrator manual.</w:t>
+      </w:r>
+    </w:p>
+    <w:p>
+      <w:pPr>
+        <w:pStyle w:val="Heading2"/>
+      </w:pPr>
+      <w:r>
+        <w:t xml:space="preserve">Older activities</w:t>
+      </w:r>
+    </w:p>
+    <w:p>
+      <w:pPr>
+        <w:spacing w:after="120"/>
+      </w:pPr>
+      <w:r>
+        <w:t xml:space="preserve">Activities that ended before the move to this Calendar weren't brought over, except awareness dates. If you need an older one, ask a Calendar administrator.</w:t>
       </w:r>
     </w:p>
     <w:p>

</xml_diff>